<commit_message>
feat(factura): add VContainer DI and cancellable async preparation
Wire one scene scope with constructor injection, distribute enemy preparation across frames, cover cancellation and restart, and update implementation documents and README.
</commit_message>
<xml_diff>
--- a/Factura_Unity_Test/Docs/Word/00_Implementation_Plan_UA.docx
+++ b/Factura_Unity_Test/Docs/Word/00_Implementation_Plan_UA.docx
@@ -7,20 +7,21 @@
         <w:pStyle w:val="aa"/>
       </w:pPr>
       <w:r>
+        <w:rPr>
+          <w:color w:val="000000"/>
+          <w:u w:val="none"/>
+        </w:rPr>
         <w:t>Factura Unity Test План реалізації</w:t>
       </w:r>
     </w:p>
     <w:p>
       <w:r>
-        <w:t>Дата: 17.10.2026. Версія: 0.2. Статус: аналіз завершено, реалізацію не розпочато.</w:t>
+        <w:t>Версія 0.3 · 19.10.2026 · Опис реалізованого прототипу та результатів перевірки в Unity Editor.</w:t>
       </w:r>
     </w:p>
     <w:p>
       <w:r>
-        <w:t xml:space="preserve">Це план тестового завдання Factura, а не розширення RED ZONE. Усі рішення нижче є пропозиціями до перевірки під час реалізації, а не </w:t>
-      </w:r>
-      <w:r>
-        <w:t>описом уже готових механік.</w:t>
+        <w:t>Основний цикл тестового завдання реалізований. Цей документ зберігає порядок робіт і пояснює прийняті рішення. DI через VContainer та асинхронна підготовка вже додані; залишилися фінальний перегляд автором і передача результату роботодавцю.</w:t>
       </w:r>
     </w:p>
     <w:p>
@@ -28,6 +29,10 @@
         <w:pStyle w:val="1"/>
       </w:pPr>
       <w:r>
+        <w:rPr>
+          <w:color w:val="000000"/>
+          <w:u w:val="none"/>
+        </w:rPr>
         <w:t>Документи проєкту</w:t>
       </w:r>
     </w:p>
@@ -87,6 +92,10 @@
         <w:pStyle w:val="1"/>
       </w:pPr>
       <w:r>
+        <w:rPr>
+          <w:color w:val="000000"/>
+          <w:u w:val="none"/>
+        </w:rPr>
         <w:t>На чому ґрунтується план</w:t>
       </w:r>
     </w:p>
@@ -158,7 +167,11 @@
         <w:pStyle w:val="1"/>
       </w:pPr>
       <w:r>
-        <w:t>Фактичний стан на початку</w:t>
+        <w:rPr>
+          <w:color w:val="000000"/>
+          <w:u w:val="none"/>
+        </w:rPr>
+        <w:t>Фактичний стан проєкту</w:t>
       </w:r>
     </w:p>
     <w:tbl>
@@ -166,12 +179,12 @@
         <w:tblW w:w="0" w:type="auto"/>
         <w:jc w:val="center"/>
         <w:tblBorders>
-          <w:top w:val="single" w:sz="5" w:space="0" w:color="D9D9D9"/>
-          <w:left w:val="single" w:sz="5" w:space="0" w:color="D9D9D9"/>
-          <w:bottom w:val="single" w:sz="5" w:space="0" w:color="D9D9D9"/>
-          <w:right w:val="single" w:sz="5" w:space="0" w:color="D9D9D9"/>
-          <w:insideH w:val="single" w:sz="5" w:space="0" w:color="D9D9D9"/>
-          <w:insideV w:val="single" w:sz="5" w:space="0" w:color="D9D9D9"/>
+          <w:top w:val="single" w:sz="4" w:space="0" w:color="D9D9D9"/>
+          <w:left w:val="single" w:sz="4" w:space="0" w:color="D9D9D9"/>
+          <w:bottom w:val="single" w:sz="4" w:space="0" w:color="D9D9D9"/>
+          <w:right w:val="single" w:sz="4" w:space="0" w:color="D9D9D9"/>
+          <w:insideH w:val="single" w:sz="4" w:space="0" w:color="D9D9D9"/>
+          <w:insideV w:val="single" w:sz="4" w:space="0" w:color="D9D9D9"/>
         </w:tblBorders>
         <w:tblLayout w:type="fixed"/>
         <w:tblLook w:val="04A0" w:firstRow="1" w:lastRow="0" w:firstColumn="1" w:lastColumn="0" w:noHBand="0" w:noVBand="1"/>
@@ -191,17 +204,17 @@
             <w:tcW w:w="3427" w:type="dxa"/>
             <w:shd w:val="clear" w:color="auto" w:fill="24445C"/>
             <w:tcMar>
-              <w:top w:w="95" w:type="dxa"/>
-              <w:left w:w="110" w:type="dxa"/>
-              <w:bottom w:w="95" w:type="dxa"/>
-              <w:right w:w="110" w:type="dxa"/>
+              <w:top w:w="80" w:type="dxa"/>
+              <w:left w:w="100" w:type="dxa"/>
+              <w:bottom w:w="80" w:type="dxa"/>
+              <w:right w:w="100" w:type="dxa"/>
             </w:tcMar>
             <w:vAlign w:val="center"/>
           </w:tcPr>
           <w:p>
             <w:pPr>
               <w:keepNext/>
-              <w:spacing w:after="20" w:line="250" w:lineRule="auto"/>
+              <w:spacing w:after="60" w:line="252" w:lineRule="auto" w:before="0"/>
             </w:pPr>
             <w:r>
               <w:rPr>
@@ -218,17 +231,17 @@
             <w:tcW w:w="6653" w:type="dxa"/>
             <w:shd w:val="clear" w:color="auto" w:fill="24445C"/>
             <w:tcMar>
-              <w:top w:w="95" w:type="dxa"/>
-              <w:left w:w="110" w:type="dxa"/>
-              <w:bottom w:w="95" w:type="dxa"/>
-              <w:right w:w="110" w:type="dxa"/>
+              <w:top w:w="80" w:type="dxa"/>
+              <w:left w:w="100" w:type="dxa"/>
+              <w:bottom w:w="80" w:type="dxa"/>
+              <w:right w:w="100" w:type="dxa"/>
             </w:tcMar>
             <w:vAlign w:val="center"/>
           </w:tcPr>
           <w:p>
             <w:pPr>
               <w:keepNext/>
-              <w:spacing w:after="20" w:line="250" w:lineRule="auto"/>
+              <w:spacing w:after="60" w:line="252" w:lineRule="auto" w:before="0"/>
             </w:pPr>
             <w:r>
               <w:rPr>
@@ -251,16 +264,16 @@
             <w:tcW w:w="3427" w:type="dxa"/>
             <w:shd w:val="clear" w:color="auto" w:fill="F0F4F7"/>
             <w:tcMar>
-              <w:top w:w="95" w:type="dxa"/>
-              <w:left w:w="110" w:type="dxa"/>
-              <w:bottom w:w="95" w:type="dxa"/>
-              <w:right w:w="110" w:type="dxa"/>
+              <w:top w:w="80" w:type="dxa"/>
+              <w:left w:w="100" w:type="dxa"/>
+              <w:bottom w:w="80" w:type="dxa"/>
+              <w:right w:w="100" w:type="dxa"/>
             </w:tcMar>
             <w:vAlign w:val="center"/>
           </w:tcPr>
           <w:p>
             <w:pPr>
-              <w:spacing w:after="20" w:line="250" w:lineRule="auto"/>
+              <w:spacing w:after="60" w:line="252" w:lineRule="auto" w:before="0"/>
             </w:pPr>
             <w:r>
               <w:rPr>
@@ -275,16 +288,16 @@
             <w:tcW w:w="6653" w:type="dxa"/>
             <w:shd w:val="clear" w:color="auto" w:fill="F0F4F7"/>
             <w:tcMar>
-              <w:top w:w="95" w:type="dxa"/>
-              <w:left w:w="110" w:type="dxa"/>
-              <w:bottom w:w="95" w:type="dxa"/>
-              <w:right w:w="110" w:type="dxa"/>
+              <w:top w:w="80" w:type="dxa"/>
+              <w:left w:w="100" w:type="dxa"/>
+              <w:bottom w:w="80" w:type="dxa"/>
+              <w:right w:w="100" w:type="dxa"/>
             </w:tcMar>
             <w:vAlign w:val="center"/>
           </w:tcPr>
           <w:p>
             <w:pPr>
-              <w:spacing w:after="20" w:line="250" w:lineRule="auto"/>
+              <w:spacing w:after="60" w:line="252" w:lineRule="auto" w:before="0"/>
             </w:pPr>
             <w:r>
               <w:rPr>
@@ -306,16 +319,16 @@
             <w:tcW w:w="3427" w:type="dxa"/>
             <w:shd w:val="clear" w:color="auto" w:fill="FFFFFF"/>
             <w:tcMar>
-              <w:top w:w="95" w:type="dxa"/>
-              <w:left w:w="110" w:type="dxa"/>
-              <w:bottom w:w="95" w:type="dxa"/>
-              <w:right w:w="110" w:type="dxa"/>
+              <w:top w:w="80" w:type="dxa"/>
+              <w:left w:w="100" w:type="dxa"/>
+              <w:bottom w:w="80" w:type="dxa"/>
+              <w:right w:w="100" w:type="dxa"/>
             </w:tcMar>
             <w:vAlign w:val="center"/>
           </w:tcPr>
           <w:p>
             <w:pPr>
-              <w:spacing w:after="20" w:line="250" w:lineRule="auto"/>
+              <w:spacing w:after="60" w:line="252" w:lineRule="auto" w:before="0"/>
             </w:pPr>
             <w:r>
               <w:rPr>
@@ -330,16 +343,16 @@
             <w:tcW w:w="6653" w:type="dxa"/>
             <w:shd w:val="clear" w:color="auto" w:fill="FFFFFF"/>
             <w:tcMar>
-              <w:top w:w="95" w:type="dxa"/>
-              <w:left w:w="110" w:type="dxa"/>
-              <w:bottom w:w="95" w:type="dxa"/>
-              <w:right w:w="110" w:type="dxa"/>
+              <w:top w:w="80" w:type="dxa"/>
+              <w:left w:w="100" w:type="dxa"/>
+              <w:bottom w:w="80" w:type="dxa"/>
+              <w:right w:w="100" w:type="dxa"/>
             </w:tcMar>
             <w:vAlign w:val="center"/>
           </w:tcPr>
           <w:p>
             <w:pPr>
-              <w:spacing w:after="20" w:line="250" w:lineRule="auto"/>
+              <w:spacing w:after="60" w:line="252" w:lineRule="auto" w:before="0"/>
             </w:pPr>
             <w:r>
               <w:rPr>
@@ -360,16 +373,16 @@
             <w:tcW w:w="3427" w:type="dxa"/>
             <w:shd w:val="clear" w:color="auto" w:fill="F0F4F7"/>
             <w:tcMar>
-              <w:top w:w="95" w:type="dxa"/>
-              <w:left w:w="110" w:type="dxa"/>
-              <w:bottom w:w="95" w:type="dxa"/>
-              <w:right w:w="110" w:type="dxa"/>
+              <w:top w:w="80" w:type="dxa"/>
+              <w:left w:w="100" w:type="dxa"/>
+              <w:bottom w:w="80" w:type="dxa"/>
+              <w:right w:w="100" w:type="dxa"/>
             </w:tcMar>
             <w:vAlign w:val="center"/>
           </w:tcPr>
           <w:p>
             <w:pPr>
-              <w:spacing w:after="20" w:line="250" w:lineRule="auto"/>
+              <w:spacing w:after="60" w:line="252" w:lineRule="auto" w:before="0"/>
             </w:pPr>
             <w:r>
               <w:rPr>
@@ -384,22 +397,22 @@
             <w:tcW w:w="6653" w:type="dxa"/>
             <w:shd w:val="clear" w:color="auto" w:fill="F0F4F7"/>
             <w:tcMar>
-              <w:top w:w="95" w:type="dxa"/>
-              <w:left w:w="110" w:type="dxa"/>
-              <w:bottom w:w="95" w:type="dxa"/>
-              <w:right w:w="110" w:type="dxa"/>
+              <w:top w:w="80" w:type="dxa"/>
+              <w:left w:w="100" w:type="dxa"/>
+              <w:bottom w:w="80" w:type="dxa"/>
+              <w:right w:w="100" w:type="dxa"/>
             </w:tcMar>
             <w:vAlign w:val="center"/>
           </w:tcPr>
           <w:p>
             <w:pPr>
-              <w:spacing w:after="20" w:line="250" w:lineRule="auto"/>
+              <w:spacing w:after="60" w:before="0" w:line="252" w:lineRule="auto"/>
             </w:pPr>
             <w:r>
               <w:rPr>
                 <w:sz w:val="20"/>
               </w:rPr>
-              <w:t>URP 17.3.0 / Input System 1.18.0 / Cinemachine 3.1.7</w:t>
+              <w:t>URP 17.3.0, Input System 1.18.0, Cinemachine 3.1.7, VContainer 1.19.0; версії зафіксовано в Packages.</w:t>
             </w:r>
           </w:p>
         </w:tc>
@@ -414,16 +427,16 @@
             <w:tcW w:w="3427" w:type="dxa"/>
             <w:shd w:val="clear" w:color="auto" w:fill="FFFFFF"/>
             <w:tcMar>
-              <w:top w:w="95" w:type="dxa"/>
-              <w:left w:w="110" w:type="dxa"/>
-              <w:bottom w:w="95" w:type="dxa"/>
-              <w:right w:w="110" w:type="dxa"/>
+              <w:top w:w="80" w:type="dxa"/>
+              <w:left w:w="100" w:type="dxa"/>
+              <w:bottom w:w="80" w:type="dxa"/>
+              <w:right w:w="100" w:type="dxa"/>
             </w:tcMar>
             <w:vAlign w:val="center"/>
           </w:tcPr>
           <w:p>
             <w:pPr>
-              <w:spacing w:after="20" w:line="250" w:lineRule="auto"/>
+              <w:spacing w:after="60" w:line="252" w:lineRule="auto" w:before="0"/>
             </w:pPr>
             <w:r>
               <w:rPr>
@@ -438,29 +451,22 @@
             <w:tcW w:w="6653" w:type="dxa"/>
             <w:shd w:val="clear" w:color="auto" w:fill="FFFFFF"/>
             <w:tcMar>
-              <w:top w:w="95" w:type="dxa"/>
-              <w:left w:w="110" w:type="dxa"/>
-              <w:bottom w:w="95" w:type="dxa"/>
-              <w:right w:w="110" w:type="dxa"/>
+              <w:top w:w="80" w:type="dxa"/>
+              <w:left w:w="100" w:type="dxa"/>
+              <w:bottom w:w="80" w:type="dxa"/>
+              <w:right w:w="100" w:type="dxa"/>
             </w:tcMar>
             <w:vAlign w:val="center"/>
           </w:tcPr>
           <w:p>
             <w:pPr>
-              <w:spacing w:after="20" w:line="250" w:lineRule="auto"/>
+              <w:spacing w:after="60" w:before="0" w:line="252" w:lineRule="auto"/>
             </w:pPr>
-            <w:r>
-              <w:rPr>
-                <w:rFonts w:ascii="Consolas" w:hAnsi="Consolas"/>
-                <w:sz w:val="20"/>
-              </w:rPr>
-              <w:t>SampleScene</w:t>
-            </w:r>
             <w:r>
               <w:rPr>
                 <w:sz w:val="20"/>
               </w:rPr>
-              <w:t>: камера, світло, Global Volume; перспективна камера</w:t>
+              <w:t>Assets/_Game/Scenes/Gameplay.unity; одна ігрова сцена в налаштуваннях запуску.</w:t>
             </w:r>
           </w:p>
         </w:tc>
@@ -475,16 +481,16 @@
             <w:tcW w:w="3427" w:type="dxa"/>
             <w:shd w:val="clear" w:color="auto" w:fill="F0F4F7"/>
             <w:tcMar>
-              <w:top w:w="95" w:type="dxa"/>
-              <w:left w:w="110" w:type="dxa"/>
-              <w:bottom w:w="95" w:type="dxa"/>
-              <w:right w:w="110" w:type="dxa"/>
+              <w:top w:w="80" w:type="dxa"/>
+              <w:left w:w="100" w:type="dxa"/>
+              <w:bottom w:w="80" w:type="dxa"/>
+              <w:right w:w="100" w:type="dxa"/>
             </w:tcMar>
             <w:vAlign w:val="center"/>
           </w:tcPr>
           <w:p>
             <w:pPr>
-              <w:spacing w:after="20" w:line="250" w:lineRule="auto"/>
+              <w:spacing w:after="60" w:line="252" w:lineRule="auto" w:before="0"/>
             </w:pPr>
             <w:r>
               <w:rPr>
@@ -499,75 +505,22 @@
             <w:tcW w:w="6653" w:type="dxa"/>
             <w:shd w:val="clear" w:color="auto" w:fill="F0F4F7"/>
             <w:tcMar>
-              <w:top w:w="95" w:type="dxa"/>
-              <w:left w:w="110" w:type="dxa"/>
-              <w:bottom w:w="95" w:type="dxa"/>
-              <w:right w:w="110" w:type="dxa"/>
+              <w:top w:w="80" w:type="dxa"/>
+              <w:left w:w="100" w:type="dxa"/>
+              <w:bottom w:w="80" w:type="dxa"/>
+              <w:right w:w="100" w:type="dxa"/>
             </w:tcMar>
             <w:vAlign w:val="center"/>
           </w:tcPr>
           <w:p>
             <w:pPr>
-              <w:spacing w:after="20" w:line="250" w:lineRule="auto"/>
+              <w:spacing w:after="60" w:before="0" w:line="252" w:lineRule="auto"/>
             </w:pPr>
-            <w:r>
-              <w:rPr>
-                <w:rFonts w:ascii="Consolas" w:hAnsi="Consolas"/>
-                <w:sz w:val="20"/>
-              </w:rPr>
-              <w:t>car.fbx</w:t>
-            </w:r>
             <w:r>
               <w:rPr>
                 <w:sz w:val="20"/>
               </w:rPr>
-              <w:t xml:space="preserve">, </w:t>
-            </w:r>
-            <w:r>
-              <w:rPr>
-                <w:rFonts w:ascii="Consolas" w:hAnsi="Consolas"/>
-                <w:sz w:val="20"/>
-              </w:rPr>
-              <w:t>turret.fbx</w:t>
-            </w:r>
-            <w:r>
-              <w:rPr>
-                <w:sz w:val="20"/>
-              </w:rPr>
-              <w:t xml:space="preserve">, </w:t>
-            </w:r>
-            <w:r>
-              <w:rPr>
-                <w:rFonts w:ascii="Consolas" w:hAnsi="Consolas"/>
-                <w:sz w:val="20"/>
-              </w:rPr>
-              <w:t>stickman.fbx</w:t>
-            </w:r>
-            <w:r>
-              <w:rPr>
-                <w:sz w:val="20"/>
-              </w:rPr>
-              <w:t xml:space="preserve">, </w:t>
-            </w:r>
-            <w:r>
-              <w:rPr>
-                <w:rFonts w:ascii="Consolas" w:hAnsi="Consolas"/>
-                <w:sz w:val="20"/>
-              </w:rPr>
-              <w:t>ground.fbx</w:t>
-            </w:r>
-            <w:r>
-              <w:rPr>
-                <w:sz w:val="20"/>
-              </w:rPr>
-              <w:t xml:space="preserve"> у </w:t>
-            </w:r>
-            <w:r>
-              <w:rPr>
-                <w:rFonts w:ascii="Consolas" w:hAnsi="Consolas"/>
-                <w:sz w:val="20"/>
-              </w:rPr>
-              <w:t>Assets/Assets</w:t>
+              <w:t>Надані моделі й текстури збережено в Assets/_Game/Art/Source; власні prefab-и окремо.</w:t>
             </w:r>
           </w:p>
         </w:tc>
@@ -582,16 +535,16 @@
             <w:tcW w:w="3427" w:type="dxa"/>
             <w:shd w:val="clear" w:color="auto" w:fill="FFFFFF"/>
             <w:tcMar>
-              <w:top w:w="95" w:type="dxa"/>
-              <w:left w:w="110" w:type="dxa"/>
-              <w:bottom w:w="95" w:type="dxa"/>
-              <w:right w:w="110" w:type="dxa"/>
+              <w:top w:w="80" w:type="dxa"/>
+              <w:left w:w="100" w:type="dxa"/>
+              <w:bottom w:w="80" w:type="dxa"/>
+              <w:right w:w="100" w:type="dxa"/>
             </w:tcMar>
             <w:vAlign w:val="center"/>
           </w:tcPr>
           <w:p>
             <w:pPr>
-              <w:spacing w:after="20" w:line="250" w:lineRule="auto"/>
+              <w:spacing w:after="60" w:line="252" w:lineRule="auto" w:before="0"/>
             </w:pPr>
             <w:r>
               <w:rPr>
@@ -606,16 +559,16 @@
             <w:tcW w:w="6653" w:type="dxa"/>
             <w:shd w:val="clear" w:color="auto" w:fill="FFFFFF"/>
             <w:tcMar>
-              <w:top w:w="95" w:type="dxa"/>
-              <w:left w:w="110" w:type="dxa"/>
-              <w:bottom w:w="95" w:type="dxa"/>
-              <w:right w:w="110" w:type="dxa"/>
+              <w:top w:w="80" w:type="dxa"/>
+              <w:left w:w="100" w:type="dxa"/>
+              <w:bottom w:w="80" w:type="dxa"/>
+              <w:right w:w="100" w:type="dxa"/>
             </w:tcMar>
             <w:vAlign w:val="center"/>
           </w:tcPr>
           <w:p>
             <w:pPr>
-              <w:spacing w:after="20" w:line="250" w:lineRule="auto"/>
+              <w:spacing w:after="60" w:line="252" w:lineRule="auto" w:before="0"/>
             </w:pPr>
             <w:r>
               <w:rPr>
@@ -656,16 +609,16 @@
             <w:tcW w:w="3427" w:type="dxa"/>
             <w:shd w:val="clear" w:color="auto" w:fill="F0F4F7"/>
             <w:tcMar>
-              <w:top w:w="95" w:type="dxa"/>
-              <w:left w:w="110" w:type="dxa"/>
-              <w:bottom w:w="95" w:type="dxa"/>
-              <w:right w:w="110" w:type="dxa"/>
+              <w:top w:w="80" w:type="dxa"/>
+              <w:left w:w="100" w:type="dxa"/>
+              <w:bottom w:w="80" w:type="dxa"/>
+              <w:right w:w="100" w:type="dxa"/>
             </w:tcMar>
             <w:vAlign w:val="center"/>
           </w:tcPr>
           <w:p>
             <w:pPr>
-              <w:spacing w:after="20" w:line="250" w:lineRule="auto"/>
+              <w:spacing w:after="60" w:line="252" w:lineRule="auto" w:before="0"/>
             </w:pPr>
             <w:r>
               <w:rPr>
@@ -680,16 +633,16 @@
             <w:tcW w:w="6653" w:type="dxa"/>
             <w:shd w:val="clear" w:color="auto" w:fill="F0F4F7"/>
             <w:tcMar>
-              <w:top w:w="95" w:type="dxa"/>
-              <w:left w:w="110" w:type="dxa"/>
-              <w:bottom w:w="95" w:type="dxa"/>
-              <w:right w:w="110" w:type="dxa"/>
+              <w:top w:w="80" w:type="dxa"/>
+              <w:left w:w="100" w:type="dxa"/>
+              <w:bottom w:w="80" w:type="dxa"/>
+              <w:right w:w="100" w:type="dxa"/>
             </w:tcMar>
             <w:vAlign w:val="center"/>
           </w:tcPr>
           <w:p>
             <w:pPr>
-              <w:spacing w:after="20" w:line="250" w:lineRule="auto"/>
+              <w:spacing w:after="60" w:line="252" w:lineRule="auto" w:before="0"/>
             </w:pPr>
             <w:r>
               <w:rPr>
@@ -710,16 +663,16 @@
             <w:tcW w:w="3427" w:type="dxa"/>
             <w:shd w:val="clear" w:color="auto" w:fill="FFFFFF"/>
             <w:tcMar>
-              <w:top w:w="95" w:type="dxa"/>
-              <w:left w:w="110" w:type="dxa"/>
-              <w:bottom w:w="95" w:type="dxa"/>
-              <w:right w:w="110" w:type="dxa"/>
+              <w:top w:w="80" w:type="dxa"/>
+              <w:left w:w="100" w:type="dxa"/>
+              <w:bottom w:w="80" w:type="dxa"/>
+              <w:right w:w="100" w:type="dxa"/>
             </w:tcMar>
             <w:vAlign w:val="center"/>
           </w:tcPr>
           <w:p>
             <w:pPr>
-              <w:spacing w:after="20" w:line="250" w:lineRule="auto"/>
+              <w:spacing w:after="60" w:line="252" w:lineRule="auto" w:before="0"/>
             </w:pPr>
             <w:r>
               <w:rPr>
@@ -734,22 +687,22 @@
             <w:tcW w:w="6653" w:type="dxa"/>
             <w:shd w:val="clear" w:color="auto" w:fill="FFFFFF"/>
             <w:tcMar>
-              <w:top w:w="95" w:type="dxa"/>
-              <w:left w:w="110" w:type="dxa"/>
-              <w:bottom w:w="95" w:type="dxa"/>
-              <w:right w:w="110" w:type="dxa"/>
+              <w:top w:w="80" w:type="dxa"/>
+              <w:left w:w="100" w:type="dxa"/>
+              <w:bottom w:w="80" w:type="dxa"/>
+              <w:right w:w="100" w:type="dxa"/>
             </w:tcMar>
             <w:vAlign w:val="center"/>
           </w:tcPr>
           <w:p>
             <w:pPr>
-              <w:spacing w:after="20" w:line="250" w:lineRule="auto"/>
+              <w:spacing w:after="60" w:before="0" w:line="252" w:lineRule="auto"/>
             </w:pPr>
             <w:r>
               <w:rPr>
                 <w:sz w:val="20"/>
               </w:rPr>
-              <w:t>Один mesh-вузол; немає підтверджених окремих ствола чи шарніра</w:t>
+              <w:t>Цілісна геометрія турелі на власних yaw та elevation pivot.</w:t>
             </w:r>
           </w:p>
         </w:tc>
@@ -764,16 +717,16 @@
             <w:tcW w:w="3427" w:type="dxa"/>
             <w:shd w:val="clear" w:color="auto" w:fill="F0F4F7"/>
             <w:tcMar>
-              <w:top w:w="95" w:type="dxa"/>
-              <w:left w:w="110" w:type="dxa"/>
-              <w:bottom w:w="95" w:type="dxa"/>
-              <w:right w:w="110" w:type="dxa"/>
+              <w:top w:w="80" w:type="dxa"/>
+              <w:left w:w="100" w:type="dxa"/>
+              <w:bottom w:w="80" w:type="dxa"/>
+              <w:right w:w="100" w:type="dxa"/>
             </w:tcMar>
             <w:vAlign w:val="center"/>
           </w:tcPr>
           <w:p>
             <w:pPr>
-              <w:spacing w:after="20" w:line="250" w:lineRule="auto"/>
+              <w:spacing w:after="60" w:line="252" w:lineRule="auto" w:before="0"/>
             </w:pPr>
             <w:r>
               <w:rPr>
@@ -788,22 +741,22 @@
             <w:tcW w:w="6653" w:type="dxa"/>
             <w:shd w:val="clear" w:color="auto" w:fill="F0F4F7"/>
             <w:tcMar>
-              <w:top w:w="95" w:type="dxa"/>
-              <w:left w:w="110" w:type="dxa"/>
-              <w:bottom w:w="95" w:type="dxa"/>
-              <w:right w:w="110" w:type="dxa"/>
+              <w:top w:w="80" w:type="dxa"/>
+              <w:left w:w="100" w:type="dxa"/>
+              <w:bottom w:w="80" w:type="dxa"/>
+              <w:right w:w="100" w:type="dxa"/>
             </w:tcMar>
             <w:vAlign w:val="center"/>
           </w:tcPr>
           <w:p>
             <w:pPr>
-              <w:spacing w:after="20" w:line="250" w:lineRule="auto"/>
+              <w:spacing w:after="60" w:before="0" w:line="252" w:lineRule="auto"/>
             </w:pPr>
             <w:r>
               <w:rPr>
                 <w:sz w:val="20"/>
               </w:rPr>
-              <w:t>У FBX не виявлено скелета, skin-деформерів чи AnimationStack</w:t>
+              <w:t>Оригінал без ріга; ігровий prefab має власний 14-кістковий ріг та процедурні анімації.</w:t>
             </w:r>
           </w:p>
         </w:tc>
@@ -818,16 +771,16 @@
             <w:tcW w:w="3427" w:type="dxa"/>
             <w:shd w:val="clear" w:color="auto" w:fill="FFFFFF"/>
             <w:tcMar>
-              <w:top w:w="95" w:type="dxa"/>
-              <w:left w:w="110" w:type="dxa"/>
-              <w:bottom w:w="95" w:type="dxa"/>
-              <w:right w:w="110" w:type="dxa"/>
+              <w:top w:w="80" w:type="dxa"/>
+              <w:left w:w="100" w:type="dxa"/>
+              <w:bottom w:w="80" w:type="dxa"/>
+              <w:right w:w="100" w:type="dxa"/>
             </w:tcMar>
             <w:vAlign w:val="center"/>
           </w:tcPr>
           <w:p>
             <w:pPr>
-              <w:spacing w:after="20" w:line="250" w:lineRule="auto"/>
+              <w:spacing w:after="60" w:line="252" w:lineRule="auto" w:before="0"/>
             </w:pPr>
             <w:r>
               <w:rPr>
@@ -842,28 +795,22 @@
             <w:tcW w:w="6653" w:type="dxa"/>
             <w:shd w:val="clear" w:color="auto" w:fill="FFFFFF"/>
             <w:tcMar>
-              <w:top w:w="95" w:type="dxa"/>
-              <w:left w:w="110" w:type="dxa"/>
-              <w:bottom w:w="95" w:type="dxa"/>
-              <w:right w:w="110" w:type="dxa"/>
+              <w:top w:w="80" w:type="dxa"/>
+              <w:left w:w="100" w:type="dxa"/>
+              <w:bottom w:w="80" w:type="dxa"/>
+              <w:right w:w="100" w:type="dxa"/>
             </w:tcMar>
             <w:vAlign w:val="center"/>
           </w:tcPr>
           <w:p>
             <w:pPr>
-              <w:spacing w:after="20" w:line="250" w:lineRule="auto"/>
+              <w:spacing w:after="60" w:before="0" w:line="252" w:lineRule="auto"/>
             </w:pPr>
             <w:r>
               <w:rPr>
                 <w:sz w:val="20"/>
               </w:rPr>
-              <w:t xml:space="preserve">Ще відсутні; наявні C# — лише скрипти стартового </w:t>
-            </w:r>
-            <w:r>
-              <w:rPr>
-                <w:sz w:val="20"/>
-              </w:rPr>
-              <w:t>Readme Unity</w:t>
+              <w:t>Готові рух, керування, стрільба, HP, AI, UI, restart, DI та async; джерела в Assets/_Game/Scripts.</w:t>
             </w:r>
           </w:p>
         </w:tc>
@@ -891,10 +838,18 @@
       <w:bookmarkStart w:id="0" w:name="_GoBack"/>
       <w:bookmarkEnd w:id="0"/>
       <w:r>
+        <w:rPr>
+          <w:color w:val="000000"/>
+          <w:u w:val="none"/>
+        </w:rPr>
         <w:lastRenderedPageBreak/>
         <w:t xml:space="preserve">Порядок </w:t>
       </w:r>
       <w:r>
+        <w:rPr>
+          <w:color w:val="000000"/>
+          <w:u w:val="none"/>
+        </w:rPr>
         <w:t>роботи та причина</w:t>
       </w:r>
     </w:p>
@@ -903,6 +858,10 @@
         <w:pStyle w:val="21"/>
       </w:pPr>
       <w:r>
+        <w:rPr>
+          <w:color w:val="000000"/>
+          <w:u w:val="none"/>
+        </w:rPr>
         <w:t>Узгоджуємо основу</w:t>
       </w:r>
     </w:p>
@@ -927,6 +886,10 @@
         <w:pStyle w:val="21"/>
       </w:pPr>
       <w:r>
+        <w:rPr>
+          <w:color w:val="000000"/>
+          <w:u w:val="none"/>
+        </w:rPr>
         <w:t>Збираємо 3D сцену</w:t>
       </w:r>
     </w:p>
@@ -954,6 +917,10 @@
         <w:pStyle w:val="21"/>
       </w:pPr>
       <w:r>
+        <w:rPr>
+          <w:color w:val="000000"/>
+          <w:u w:val="none"/>
+        </w:rPr>
         <w:t>Машина та камера</w:t>
       </w:r>
     </w:p>
@@ -965,7 +932,7 @@
     <w:p>
       <w:pPr/>
       <w:r>
-        <w:t>Камера використовуватиме Cinemachine Brain, Follow та Rotation Composer. Ціль стеження належатиме машині й не повторюватиме обертання турелі. Це виконує вимогу ТЗ щодо камери позаду автомобіля; конкретний власний CameraFollow у ТЗ не вимагається.</w:t>
+        <w:t>Cinemachine 3.1.7 налаштований: Follow і Rotation Composer на Cinemachine Camera, Brain на Main Camera. Окрема ціль на машині не успадковує поворот турелі; restart скидає попередній стан камери.</w:t>
       </w:r>
     </w:p>
     <w:p>
@@ -984,6 +951,10 @@
         <w:pStyle w:val="21"/>
       </w:pPr>
       <w:r>
+        <w:rPr>
+          <w:color w:val="000000"/>
+          <w:u w:val="none"/>
+        </w:rPr>
         <w:t>Стани та HP</w:t>
       </w:r>
     </w:p>
@@ -1011,12 +982,16 @@
         <w:pStyle w:val="21"/>
       </w:pPr>
       <w:r>
+        <w:rPr>
+          <w:color w:val="000000"/>
+          <w:u w:val="none"/>
+        </w:rPr>
         <w:t>Турель та кулі</w:t>
       </w:r>
     </w:p>
     <w:p>
       <w:r>
-        <w:t>Свайп / drag мишею, обмежений yaw, автопостріли, muzzle flash, повторне використання куль</w:t>
+        <w:t>Турель обертається на 360 градусів із SmoothDampAngle. На ПК миша задає точку наведення без утримання кнопки; touch використовує нормалізований горизонтальний drag. Напрям кулі після запуску незмінний.</w:t>
       </w:r>
     </w:p>
     <w:p>
@@ -1038,6 +1013,10 @@
         <w:pStyle w:val="21"/>
       </w:pPr>
       <w:r>
+        <w:rPr>
+          <w:color w:val="000000"/>
+          <w:u w:val="none"/>
+        </w:rPr>
         <w:t>Один ворог</w:t>
       </w:r>
     </w:p>
@@ -1065,6 +1044,10 @@
         <w:pStyle w:val="21"/>
       </w:pPr>
       <w:r>
+        <w:rPr>
+          <w:color w:val="000000"/>
+          <w:u w:val="none"/>
+        </w:rPr>
         <w:t>Розміщення ворогів</w:t>
       </w:r>
     </w:p>
@@ -1092,12 +1075,16 @@
         <w:pStyle w:val="21"/>
       </w:pPr>
       <w:r>
+        <w:rPr>
+          <w:color w:val="000000"/>
+          <w:u w:val="none"/>
+        </w:rPr>
         <w:t>Подача та анімації</w:t>
       </w:r>
     </w:p>
     <w:p>
       <w:r>
-        <w:t>Обертання коліс, віддача й спалах, HP-feedback; за потреби окремий ріг/кліпи Idle/Run/Attack/Death</w:t>
+        <w:t>Власний 14-кістковий ріг і процедурні idle, run, attack, hit та death для наданої моделі ворога. Додані muzzle flash, віддача, попадання, поштовх, пошкодження машини та ненав’язлива музика.</w:t>
       </w:r>
     </w:p>
     <w:p>
@@ -1116,15 +1103,23 @@
         <w:pStyle w:val="21"/>
       </w:pPr>
       <w:r>
+        <w:rPr>
+          <w:color w:val="000000"/>
+          <w:u w:val="none"/>
+        </w:rPr>
         <w:t>Перевірка</w:t>
       </w:r>
       <w:r>
+        <w:rPr>
+          <w:color w:val="000000"/>
+          <w:u w:val="none"/>
+        </w:rPr>
         <w:t xml:space="preserve"> та передача</w:t>
       </w:r>
     </w:p>
     <w:p>
       <w:r>
-        <w:t>Перевіряємо win/lose/restart, готуємо чистий Git та відео до 1 хвилини, підсумовуємо фактичний час</w:t>
+        <w:t>Перевірено Win, Lose, restart, ближні влучання, меню та DI/async. Відео тривалістю 38,53 с показує обидва результати зі звуком Unity. Вихідний код публікується в окремій гілці codex/factura-unity-test; загальний витрачений час автор уточнює перед відправленням.</w:t>
       </w:r>
     </w:p>
     <w:p>
@@ -1141,10 +1136,7 @@
     </w:p>
     <w:p>
       <w:r>
-        <w:t xml:space="preserve">Для кожного завершеного етапу </w:t>
-      </w:r>
-      <w:r>
-        <w:t>оновлюємо журнал і шпаргалку. Відмітка «реалізовано» з'являється лише після наявності коду/сцени; «перевірено» — лише після відповідної перевірки.</w:t>
+        <w:t>TDD і Motherboard звірені з реалізацією. Приватні журнал та шпаргалка оновлюються окремо й не потрапляють у Git.</w:t>
       </w:r>
     </w:p>
     <w:p>
@@ -1152,6 +1144,10 @@
         <w:pStyle w:val="1"/>
       </w:pPr>
       <w:r>
+        <w:rPr>
+          <w:color w:val="000000"/>
+          <w:u w:val="none"/>
+        </w:rPr>
         <w:t>Обсяг першої версії</w:t>
       </w:r>
     </w:p>
@@ -1173,7 +1169,7 @@
     </w:p>
     <w:p>
       <w:r>
-        <w:t>Мобільне керування є основним орієнтиром. Android/APK прямо не вимагаються в ТЗ. Мишка потрібна як еквівалент пальця для перевірки в Editor, а не як інша бойова система.</w:t>
+        <w:t>Для зручності перевірки на ПК додано абсолютне наведення мишею. На touch збережено горизонтальний свайп; рух автомобіля та автоматична стрільба спільні.</w:t>
       </w:r>
     </w:p>
     <w:p>
@@ -1181,7 +1177,11 @@
         <w:pStyle w:val="1"/>
       </w:pPr>
       <w:r>
-        <w:t>До першої зміни сцени</w:t>
+        <w:rPr>
+          <w:color w:val="000000"/>
+          <w:u w:val="none"/>
+        </w:rPr>
+        <w:t>Обмеження робочого процесу</w:t>
       </w:r>
     </w:p>
     <w:p>
@@ -1247,7 +1247,11 @@
         <w:pStyle w:val="1"/>
       </w:pPr>
       <w:r>
-        <w:t>Невизначеності які перевіримо реалізацією</w:t>
+        <w:rPr>
+          <w:color w:val="000000"/>
+          <w:u w:val="none"/>
+        </w:rPr>
+        <w:t>Уточнення після реалізації</w:t>
       </w:r>
     </w:p>
     <w:p>
@@ -1255,7 +1259,7 @@
         <w:pStyle w:val="a0"/>
       </w:pPr>
       <w:r>
-        <w:t>Реальні розміри моделей і pivot: відомі сирі вузли FBX, але bounds після імпорту в сцені ще не перевірені.</w:t>
+        <w:t>Масштаб моделей і позиції collider та Muzzle перевірено в ігрових сценаріях, зокрема при контакті ворога з кузовом.</w:t>
       </w:r>
     </w:p>
     <w:p>
@@ -1263,10 +1267,7 @@
         <w:pStyle w:val="a0"/>
       </w:pPr>
       <w:r>
-        <w:t xml:space="preserve">Чи вистачає обертання цілісної турелі навколо вертикального pivot </w:t>
-      </w:r>
-      <w:r>
-        <w:t>для узгодженого вигляду.</w:t>
+        <w:t>Цілісну модель турелі встановлено на окремі yaw та elevation pivot. Наведення висоти в межах коридору пострілу не перетворює кулі на самонавідні.</w:t>
       </w:r>
     </w:p>
     <w:p>
@@ -1274,7 +1275,7 @@
         <w:pStyle w:val="a0"/>
       </w:pPr>
       <w:r>
-        <w:t>Чи потрібен Mixamo або інший дозволений ріг для цього stickman. Не вважати можливість автоматичного рігінгу гарантованою.</w:t>
+        <w:t>Оригінальний stickman збережений. Для ігрового prefab створено власний ріг; Mixamo не використовується.</w:t>
       </w:r>
     </w:p>
     <w:p>
@@ -1282,7 +1283,7 @@
         <w:pStyle w:val="a0"/>
       </w:pPr>
       <w:r>
-        <w:t>Чутливість свайпа, кути наведення, кількість ворогів і HP — стартові параметри, не затверджений баланс.</w:t>
+        <w:t>Поточні параметри: маршрут 100 м, швидкість 4 м/с, 18 ворогів, HP машини 100. Це налаштування прототипу, а не доведений баланс готової мобільної гри.</w:t>
       </w:r>
     </w:p>
     <w:p>
@@ -1290,10 +1291,7 @@
         <w:pStyle w:val="a0"/>
       </w:pPr>
       <w:r>
-        <w:t>DI-ко</w:t>
-      </w:r>
-      <w:r>
-        <w:t>нтейнер — потенційний плюс за критеріями ТЗ; рішення зафіксоване в TDD, пакет ще не додано.</w:t>
+        <w:t>VContainer 1.19.0 встановлений через scoped OpenUPM registry. GameLifetimeScope реєструє компоненти, а контейнер створює GameBootstrap через конструктор. Bootstrap не вилучений: він лишається координатором запуску та restart.</w:t>
       </w:r>
     </w:p>
     <w:sectPr>
@@ -2007,8 +2005,10 @@
       <w:rFonts w:asciiTheme="majorHAnsi" w:eastAsiaTheme="majorEastAsia" w:hAnsiTheme="majorHAnsi" w:cstheme="majorBidi"/>
       <w:b/>
       <w:bCs/>
+      <w:color w:val="000000"/>
       <w:sz w:val="28"/>
       <w:szCs w:val="28"/>
+      <w:u w:val="none"/>
     </w:rPr>
   </w:style>
   <w:style w:type="paragraph" w:styleId="21">
@@ -2030,8 +2030,10 @@
       <w:rFonts w:asciiTheme="majorHAnsi" w:eastAsiaTheme="majorEastAsia" w:hAnsiTheme="majorHAnsi" w:cstheme="majorBidi"/>
       <w:b/>
       <w:bCs/>
+      <w:color w:val="000000"/>
       <w:sz w:val="24"/>
       <w:szCs w:val="26"/>
+      <w:u w:val="none"/>
     </w:rPr>
   </w:style>
   <w:style w:type="paragraph" w:styleId="31">
@@ -2053,6 +2055,8 @@
       <w:rFonts w:asciiTheme="majorHAnsi" w:eastAsiaTheme="majorEastAsia" w:hAnsiTheme="majorHAnsi" w:cstheme="majorBidi"/>
       <w:b/>
       <w:bCs/>
+      <w:color w:val="000000"/>
+      <w:u w:val="none"/>
     </w:rPr>
   </w:style>
   <w:style w:type="paragraph" w:styleId="4">
@@ -2334,10 +2338,12 @@
     <w:rPr>
       <w:rFonts w:asciiTheme="majorHAnsi" w:eastAsiaTheme="majorEastAsia" w:hAnsiTheme="majorHAnsi" w:cstheme="majorBidi"/>
       <w:b/>
+      <w:color w:val="000000"/>
       <w:spacing w:val="5"/>
       <w:kern w:val="28"/>
       <w:sz w:val="42"/>
       <w:szCs w:val="52"/>
+      <w:u w:val="none"/>
     </w:rPr>
   </w:style>
   <w:style w:type="character" w:customStyle="1" w:styleId="ab">
@@ -2373,8 +2379,10 @@
       <w:rFonts w:asciiTheme="majorHAnsi" w:eastAsiaTheme="majorEastAsia" w:hAnsiTheme="majorHAnsi" w:cstheme="majorBidi"/>
       <w:i/>
       <w:iCs/>
+      <w:color w:val="000000"/>
       <w:spacing w:val="15"/>
       <w:szCs w:val="24"/>
+      <w:u w:val="none"/>
     </w:rPr>
   </w:style>
   <w:style w:type="character" w:customStyle="1" w:styleId="ad">

</xml_diff>

<commit_message>
Polish Factura test documentation and code comments
</commit_message>
<xml_diff>
--- a/Factura_Unity_Test/Docs/Word/00_Implementation_Plan_UA.docx
+++ b/Factura_Unity_Test/Docs/Word/00_Implementation_Plan_UA.docx
@@ -16,12 +16,12 @@
     </w:p>
     <w:p>
       <w:r>
-        <w:t>Версія 0.3 · 19.10.2026 · Опис реалізованого прототипу та результатів перевірки в Unity Editor.</w:t>
+        <w:t>Версія 0.4 · 20.10.2026 · Реалізація прототипу та перевірки в Unity Editor</w:t>
       </w:r>
     </w:p>
     <w:p>
       <w:r>
-        <w:t>Основний цикл тестового завдання реалізований. Цей документ зберігає порядок робіт і пояснює прийняті рішення. DI через VContainer та асинхронна підготовка вже додані; залишилися фінальний перегляд автором і передача результату роботодавцю.</w:t>
+        <w:t>Основний цикл тестового завдання реалізований. Документ описує послідовність реалізації, прийняті рішення та перевірений обсяг. Залежності збираються через VContainer, підготовка ворогів розподілена між кадрами.</w:t>
       </w:r>
     </w:p>
     <w:p>
@@ -138,7 +138,7 @@
         <w:pStyle w:val="a0"/>
       </w:pPr>
       <w:r>
-        <w:t>Файли та налаштування цього проєкту, прочитані без зміни сцени.</w:t>
+        <w:t>Реалізована сцена та конфігурація проєкту.</w:t>
       </w:r>
     </w:p>
     <w:p>
@@ -304,7 +304,7 @@
                 <w:rFonts w:ascii="Consolas" w:hAnsi="Consolas"/>
                 <w:sz w:val="20"/>
               </w:rPr>
-              <w:t>D:\Unity\Unity Game\Unity-Game\Factura_Unity_Test</w:t>
+              <w:t>Factura_Unity_Test</w:t>
             </w:r>
           </w:p>
         </w:tc>
@@ -867,7 +867,7 @@
     </w:p>
     <w:p>
       <w:r>
-        <w:t>Фіксуємо цей GDD/TDD, припущення й критерії приймання</w:t>
+        <w:t>Визначено core loop, обсяг прототипу та критерії приймання.</w:t>
       </w:r>
     </w:p>
     <w:p>
@@ -875,11 +875,9 @@
         <w:rPr>
           <w:b/>
         </w:rPr>
-        <w:t xml:space="preserve">Чому та критерій готовності. </w:t>
+        <w:t>Прототип зосереджений на керуванні туреллю, русі автомобіля, бою та завершенні заїзду; економіка референсу не переносилася.</w:t>
       </w:r>
-      <w:r>
-        <w:t>Не переносимо зайві механіки з повної гри. Документи позначені як план</w:t>
-      </w:r>
+      <w:r/>
     </w:p>
     <w:p>
       <w:pPr>
@@ -1119,7 +1117,7 @@
     </w:p>
     <w:p>
       <w:r>
-        <w:t>Перевірено Win, Lose, restart, ближні влучання, меню та DI/async. Відео тривалістю 38,53 с показує обидва результати зі звуком Unity. Вихідний код публікується в окремій гілці codex/factura-unity-test; загальний витрачений час автор уточнює перед відправленням.</w:t>
+        <w:t>У Unity Editor перевірено перемогу, поразку, повторний заїзд, ближні влучання, меню та DI/async. Вихідний код доступний у гілці factura-test; відеодемонстрація та архів проєкту — на сторінці матеріалів. Період роботи над тестовим: 17–20 жовтня 2026 року.</w:t>
       </w:r>
     </w:p>
     <w:p>
@@ -1127,16 +1125,13 @@
         <w:rPr>
           <w:b/>
         </w:rPr>
-        <w:lastRenderedPageBreak/>
-        <w:t xml:space="preserve">Чому та критерій готовності. </w:t>
+        <w:t>Матеріали для перевірки містять вихідний Unity-проєкт і відео. Android-збірка та перевірка на фізичному пристрої не виконувалися.</w:t>
       </w:r>
-      <w:r>
-        <w:t>Це прямо запитані результати. Build/APK — лише за окремою потребою, не автоматично</w:t>
-      </w:r>
+      <w:r/>
     </w:p>
     <w:p>
       <w:r>
-        <w:t>TDD і Motherboard звірені з реалізацією. Приватні журнал та шпаргалка оновлюються окремо й не потрапляють у Git.</w:t>
+        <w:t>TDD і схема систем описують фактичну реалізацію прототипу.</w:t>
       </w:r>
     </w:p>
     <w:p>
@@ -1170,76 +1165,6 @@
     <w:p>
       <w:r>
         <w:t>Для зручності перевірки на ПК додано абсолютне наведення мишею. На touch збережено горизонтальний свайп; рух автомобіля та автоматична стрільба спільні.</w:t>
-      </w:r>
-    </w:p>
-    <w:p>
-      <w:pPr>
-        <w:pStyle w:val="1"/>
-      </w:pPr>
-      <w:r>
-        <w:rPr>
-          <w:color w:val="000000"/>
-          <w:u w:val="none"/>
-        </w:rPr>
-        <w:t>Обмеження робочого процесу</w:t>
-      </w:r>
-    </w:p>
-    <w:p>
-      <w:pPr>
-        <w:pStyle w:val="a0"/>
-      </w:pPr>
-      <w:r>
-        <w:t>Узгодити використання цього, а не попередньог</w:t>
-      </w:r>
-      <w:r>
-        <w:t xml:space="preserve">о проєкту поза </w:t>
-      </w:r>
-      <w:r>
-        <w:rPr>
-          <w:rFonts w:ascii="Consolas" w:hAnsi="Consolas"/>
-          <w:sz w:val="20"/>
-        </w:rPr>
-        <w:t>Unity-Game</w:t>
-      </w:r>
-      <w:r>
-        <w:t>.</w:t>
-      </w:r>
-    </w:p>
-    <w:p>
-      <w:pPr>
-        <w:pStyle w:val="a0"/>
-      </w:pPr>
-      <w:r>
-        <w:t>Зберегти зміни в Editor; не редагувати одночасно відкриту сцену ззовні.</w:t>
-      </w:r>
-    </w:p>
-    <w:p>
-      <w:pPr>
-        <w:pStyle w:val="a0"/>
-      </w:pPr>
-      <w:r>
-        <w:t>Не створювати вкладений Git-репозиторій і не публікувати сторонні асети до перевірки прав та обсягу передачі роботодавцю.</w:t>
-      </w:r>
-    </w:p>
-    <w:p>
-      <w:pPr>
-        <w:pStyle w:val="a0"/>
-      </w:pPr>
-      <w:r>
-        <w:t>Не змінювати старі проєкти, батьків</w:t>
-      </w:r>
-      <w:r>
-        <w:t xml:space="preserve">ський </w:t>
-      </w:r>
-      <w:r>
-        <w:rPr>
-          <w:rFonts w:ascii="Consolas" w:hAnsi="Consolas"/>
-          <w:sz w:val="20"/>
-        </w:rPr>
-        <w:t>.gitignore</w:t>
-      </w:r>
-      <w:r>
-        <w:t xml:space="preserve"> та чужі локальні зміни.</w:t>
       </w:r>
     </w:p>
     <w:p>
@@ -1296,6 +1221,7 @@
     </w:p>
     <w:sectPr>
       <w:footerReference w:type="default" r:id="rId15"/>
+      <w:headerReference w:type="default" r:id="rId11"/>
       <w:pgSz w:w="12240" w:h="15840"/>
       <w:pgMar w:top="936" w:right="1080" w:bottom="936" w:left="1080" w:header="720" w:footer="360" w:gutter="0"/>
       <w:cols w:space="720"/>
@@ -1388,6 +1314,16 @@
     </w:p>
   </w:footnote>
 </w:footnotes>
+</file>
+
+<file path=word/header1.xml><?xml version="1.0" encoding="utf-8"?>
+<w:hdr xmlns:m="http://schemas.openxmlformats.org/officeDocument/2006/math" xmlns:mc="http://schemas.openxmlformats.org/markup-compatibility/2006" xmlns:mo="http://schemas.microsoft.com/office/mac/office/2008/main" xmlns:mv="urn:schemas-microsoft-com:mac:vml" xmlns:o="urn:schemas-microsoft-com:office:office" xmlns:r="http://schemas.openxmlformats.org/officeDocument/2006/relationships" xmlns:v="urn:schemas-microsoft-com:vml" xmlns:w10="urn:schemas-microsoft-com:office:word" xmlns:w14="http://schemas.microsoft.com/office/word/2010/wordml" xmlns:w="http://schemas.openxmlformats.org/wordprocessingml/2006/main" xmlns:wne="http://schemas.microsoft.com/office/word/2006/wordml" xmlns:wp14="http://schemas.microsoft.com/office/word/2010/wordprocessingDrawing" xmlns:wp="http://schemas.openxmlformats.org/drawingml/2006/wordprocessingDrawing" xmlns:wpc="http://schemas.microsoft.com/office/word/2010/wordprocessingCanvas" xmlns:wpg="http://schemas.microsoft.com/office/word/2010/wordprocessingGroup" xmlns:wpi="http://schemas.microsoft.com/office/word/2010/wordprocessingInk" xmlns:wps="http://schemas.microsoft.com/office/word/2010/wordprocessingShape" mc:Ignorable="w14 wp14">
+  <w:p>
+    <w:pPr>
+      <w:pStyle w:val="Header"/>
+    </w:pPr>
+  </w:p>
+</w:hdr>
 </file>
 
 <file path=word/numbering.xml><?xml version="1.0" encoding="utf-8"?>

</xml_diff>